<commit_message>
Enhance README.md and submission DOCX with explicit AI Tools Used documentation
</commit_message>
<xml_diff>
--- a/AI Dynamic Web Lab Generation for Core CSS Concepts/Nebyu_AI_Dynamic_Web_Lab_Generation_for_Core_CSS_Concepts.docx
+++ b/AI Dynamic Web Lab Generation for Core CSS Concepts/Nebyu_AI_Dynamic_Web_Lab_Generation_for_Core_CSS_Concepts.docx
@@ -27,6 +27,16 @@
       </w:r>
       <w:r>
         <w:t>https://github.com/nebyu11/Artificial-Intelligence-in-Software-Engineering</w:t>
+        <w:br/>
+      </w:r>
+      <w:r>
+        <w:rPr>
+          <w:b/>
+        </w:rPr>
+        <w:t xml:space="preserve">AI Development Tool Used: </w:t>
+      </w:r>
+      <w:r>
+        <w:t>Antigravity AI Assistant &amp; Interactive Canvas Frontend Generator</w:t>
         <w:br/>
       </w:r>
     </w:p>
@@ -385,6 +395,8 @@
         <w:t>Repository URL: https://github.com/nebyu11/Artificial-Intelligence-in-Software-Engineering</w:t>
         <w:br/>
         <w:t>Task Directory: AI Dynamic Web Lab Generation for Core CSS Concepts</w:t>
+        <w:br/>
+        <w:t>AI Tool Used: Antigravity AI Assistant &amp; Canvas Frontend Generator</w:t>
       </w:r>
     </w:p>
     <w:sectPr>

</xml_diff>